<commit_message>
Add date prefix to all articles, use exact media questions as headers
</commit_message>
<xml_diff>
--- a/ответы/2026-06-16_кибер-медиа-iot-безопасность.docx
+++ b/ответы/2026-06-16_кибер-медиа-iot-безопасность.docx
@@ -17,7 +17,7 @@
     <w:p/>
     <w:p>
       <w:r>
-        <w:t>Какие новые векторы атак появились с распространением локальных экосистем умного дома?</w:t>
+        <w:t>Какие новые векторы атак появились с распространением локальных экосистем умного дома (Matter, Thread, Home Assistant)? Чем они отличаются от угроз, характерных для облачных IoT-платформ?</w:t>
       </w:r>
     </w:p>
     <w:p/>
@@ -54,7 +54,7 @@
     <w:p/>
     <w:p>
       <w:r>
-        <w:t>В каких сценариях гостевой сети уже недостаточно и нужна полноценная сегментация через VLAN?</w:t>
+        <w:t>В каких сценариях для защиты камер, NAS и других IoT-устройств уже недостаточно гостевой сети на роутере и требуется полноценная сегментация с помощью VLAN и правил межсетевого экрана?</w:t>
       </w:r>
     </w:p>
     <w:p/>
@@ -97,7 +97,7 @@
     <w:p/>
     <w:p>
       <w:r>
-        <w:t>Какие ошибки в настройке устройств злоумышленники используют чаще всего в 2026 году?</w:t>
+        <w:t>Какие ошибки в настройке роутеров, IP-камер и других IoT-устройств злоумышленники чаще всего используют в 2026 году для получения доступа к домашней сети?</w:t>
       </w:r>
     </w:p>
     <w:p/>
@@ -140,7 +140,7 @@
     <w:p/>
     <w:p>
       <w:r>
-        <w:t>Какие архитектурные решения эффективно защищают видеокамеры и видеопоток при удалённом доступе?</w:t>
+        <w:t>Какие архитектурные решения наиболее эффективно снижают риск компрометации IP-камер и утечки видеопотока при удалённом доступе?</w:t>
       </w:r>
     </w:p>
     <w:p/>
@@ -171,7 +171,7 @@
     <w:p/>
     <w:p>
       <w:r>
-        <w:t>Какой минимум безопасности обязателен для домашней сети с камерами и IoT-устройствами?</w:t>
+        <w:t>Какие проверки и настройки вы считаете обязательным минимумом безопасности для домашней сети с роутером, IP-камерами и другими IoT-устройствами? Почему именно эти меры дают наибольший эффект?</w:t>
       </w:r>
     </w:p>
     <w:p/>
@@ -641,7 +641,7 @@
     <w:link w:val="10"/>
     <w:uiPriority w:val="9"/>
     <w:qFormat/>
-    <w:rsid w:val="007365F6"/>
+    <w:rsid w:val="00F66A84"/>
     <w:pPr>
       <w:keepNext/>
       <w:keepLines/>
@@ -664,7 +664,7 @@
     <w:semiHidden/>
     <w:unhideWhenUsed/>
     <w:qFormat/>
-    <w:rsid w:val="007365F6"/>
+    <w:rsid w:val="00F66A84"/>
     <w:pPr>
       <w:keepNext/>
       <w:keepLines/>
@@ -687,7 +687,7 @@
     <w:semiHidden/>
     <w:unhideWhenUsed/>
     <w:qFormat/>
-    <w:rsid w:val="007365F6"/>
+    <w:rsid w:val="00F66A84"/>
     <w:pPr>
       <w:keepNext/>
       <w:keepLines/>
@@ -710,7 +710,7 @@
     <w:semiHidden/>
     <w:unhideWhenUsed/>
     <w:qFormat/>
-    <w:rsid w:val="007365F6"/>
+    <w:rsid w:val="00F66A84"/>
     <w:pPr>
       <w:keepNext/>
       <w:keepLines/>
@@ -733,7 +733,7 @@
     <w:semiHidden/>
     <w:unhideWhenUsed/>
     <w:qFormat/>
-    <w:rsid w:val="007365F6"/>
+    <w:rsid w:val="00F66A84"/>
     <w:pPr>
       <w:keepNext/>
       <w:keepLines/>
@@ -754,7 +754,7 @@
     <w:semiHidden/>
     <w:unhideWhenUsed/>
     <w:qFormat/>
-    <w:rsid w:val="007365F6"/>
+    <w:rsid w:val="00F66A84"/>
     <w:pPr>
       <w:keepNext/>
       <w:keepLines/>
@@ -777,7 +777,7 @@
     <w:semiHidden/>
     <w:unhideWhenUsed/>
     <w:qFormat/>
-    <w:rsid w:val="007365F6"/>
+    <w:rsid w:val="00F66A84"/>
     <w:pPr>
       <w:keepNext/>
       <w:keepLines/>
@@ -798,7 +798,7 @@
     <w:semiHidden/>
     <w:unhideWhenUsed/>
     <w:qFormat/>
-    <w:rsid w:val="007365F6"/>
+    <w:rsid w:val="00F66A84"/>
     <w:pPr>
       <w:keepNext/>
       <w:keepLines/>
@@ -821,7 +821,7 @@
     <w:semiHidden/>
     <w:unhideWhenUsed/>
     <w:qFormat/>
-    <w:rsid w:val="007365F6"/>
+    <w:rsid w:val="00F66A84"/>
     <w:pPr>
       <w:keepNext/>
       <w:keepLines/>
@@ -865,7 +865,7 @@
     <w:basedOn w:val="a0"/>
     <w:link w:val="1"/>
     <w:uiPriority w:val="9"/>
-    <w:rsid w:val="007365F6"/>
+    <w:rsid w:val="00F66A84"/>
     <w:rPr>
       <w:rFonts w:asciiTheme="majorHAnsi" w:eastAsiaTheme="majorEastAsia" w:hAnsiTheme="majorHAnsi" w:cstheme="majorBidi"/>
       <w:color w:val="0F4761" w:themeColor="accent1" w:themeShade="BF"/>
@@ -879,7 +879,7 @@
     <w:link w:val="2"/>
     <w:uiPriority w:val="9"/>
     <w:semiHidden/>
-    <w:rsid w:val="007365F6"/>
+    <w:rsid w:val="00F66A84"/>
     <w:rPr>
       <w:rFonts w:asciiTheme="majorHAnsi" w:eastAsiaTheme="majorEastAsia" w:hAnsiTheme="majorHAnsi" w:cstheme="majorBidi"/>
       <w:color w:val="0F4761" w:themeColor="accent1" w:themeShade="BF"/>
@@ -893,7 +893,7 @@
     <w:link w:val="3"/>
     <w:uiPriority w:val="9"/>
     <w:semiHidden/>
-    <w:rsid w:val="007365F6"/>
+    <w:rsid w:val="00F66A84"/>
     <w:rPr>
       <w:rFonts w:eastAsiaTheme="majorEastAsia" w:cstheme="majorBidi"/>
       <w:color w:val="0F4761" w:themeColor="accent1" w:themeShade="BF"/>
@@ -907,7 +907,7 @@
     <w:link w:val="4"/>
     <w:uiPriority w:val="9"/>
     <w:semiHidden/>
-    <w:rsid w:val="007365F6"/>
+    <w:rsid w:val="00F66A84"/>
     <w:rPr>
       <w:rFonts w:eastAsiaTheme="majorEastAsia" w:cstheme="majorBidi"/>
       <w:i/>
@@ -921,7 +921,7 @@
     <w:link w:val="5"/>
     <w:uiPriority w:val="9"/>
     <w:semiHidden/>
-    <w:rsid w:val="007365F6"/>
+    <w:rsid w:val="00F66A84"/>
     <w:rPr>
       <w:rFonts w:eastAsiaTheme="majorEastAsia" w:cstheme="majorBidi"/>
       <w:color w:val="0F4761" w:themeColor="accent1" w:themeShade="BF"/>
@@ -933,7 +933,7 @@
     <w:link w:val="6"/>
     <w:uiPriority w:val="9"/>
     <w:semiHidden/>
-    <w:rsid w:val="007365F6"/>
+    <w:rsid w:val="00F66A84"/>
     <w:rPr>
       <w:rFonts w:eastAsiaTheme="majorEastAsia" w:cstheme="majorBidi"/>
       <w:i/>
@@ -947,7 +947,7 @@
     <w:link w:val="7"/>
     <w:uiPriority w:val="9"/>
     <w:semiHidden/>
-    <w:rsid w:val="007365F6"/>
+    <w:rsid w:val="00F66A84"/>
     <w:rPr>
       <w:rFonts w:eastAsiaTheme="majorEastAsia" w:cstheme="majorBidi"/>
       <w:color w:val="595959" w:themeColor="text1" w:themeTint="A6"/>
@@ -959,7 +959,7 @@
     <w:link w:val="8"/>
     <w:uiPriority w:val="9"/>
     <w:semiHidden/>
-    <w:rsid w:val="007365F6"/>
+    <w:rsid w:val="00F66A84"/>
     <w:rPr>
       <w:rFonts w:eastAsiaTheme="majorEastAsia" w:cstheme="majorBidi"/>
       <w:i/>
@@ -973,7 +973,7 @@
     <w:link w:val="9"/>
     <w:uiPriority w:val="9"/>
     <w:semiHidden/>
-    <w:rsid w:val="007365F6"/>
+    <w:rsid w:val="00F66A84"/>
     <w:rPr>
       <w:rFonts w:eastAsiaTheme="majorEastAsia" w:cstheme="majorBidi"/>
       <w:color w:val="272727" w:themeColor="text1" w:themeTint="D8"/>
@@ -986,7 +986,7 @@
     <w:link w:val="a4"/>
     <w:uiPriority w:val="10"/>
     <w:qFormat/>
-    <w:rsid w:val="007365F6"/>
+    <w:rsid w:val="00F66A84"/>
     <w:pPr>
       <w:spacing w:after="80" w:line="240" w:lineRule="auto"/>
       <w:contextualSpacing/>
@@ -1004,7 +1004,7 @@
     <w:basedOn w:val="a0"/>
     <w:link w:val="a3"/>
     <w:uiPriority w:val="10"/>
-    <w:rsid w:val="007365F6"/>
+    <w:rsid w:val="00F66A84"/>
     <w:rPr>
       <w:rFonts w:asciiTheme="majorHAnsi" w:eastAsiaTheme="majorEastAsia" w:hAnsiTheme="majorHAnsi" w:cstheme="majorBidi"/>
       <w:spacing w:val="-10"/>
@@ -1020,7 +1020,7 @@
     <w:link w:val="a6"/>
     <w:uiPriority w:val="11"/>
     <w:qFormat/>
-    <w:rsid w:val="007365F6"/>
+    <w:rsid w:val="00F66A84"/>
     <w:pPr>
       <w:numPr>
         <w:ilvl w:val="1"/>
@@ -1039,7 +1039,7 @@
     <w:basedOn w:val="a0"/>
     <w:link w:val="a5"/>
     <w:uiPriority w:val="11"/>
-    <w:rsid w:val="007365F6"/>
+    <w:rsid w:val="00F66A84"/>
     <w:rPr>
       <w:rFonts w:eastAsiaTheme="majorEastAsia" w:cstheme="majorBidi"/>
       <w:color w:val="595959" w:themeColor="text1" w:themeTint="A6"/>
@@ -1055,7 +1055,7 @@
     <w:link w:val="22"/>
     <w:uiPriority w:val="29"/>
     <w:qFormat/>
-    <w:rsid w:val="007365F6"/>
+    <w:rsid w:val="00F66A84"/>
     <w:pPr>
       <w:spacing w:before="160"/>
       <w:jc w:val="center"/>
@@ -1071,7 +1071,7 @@
     <w:basedOn w:val="a0"/>
     <w:link w:val="21"/>
     <w:uiPriority w:val="29"/>
-    <w:rsid w:val="007365F6"/>
+    <w:rsid w:val="00F66A84"/>
     <w:rPr>
       <w:i/>
       <w:iCs/>
@@ -1083,7 +1083,7 @@
     <w:basedOn w:val="a"/>
     <w:uiPriority w:val="34"/>
     <w:qFormat/>
-    <w:rsid w:val="007365F6"/>
+    <w:rsid w:val="00F66A84"/>
     <w:pPr>
       <w:ind w:left="720"/>
       <w:contextualSpacing/>
@@ -1094,7 +1094,7 @@
     <w:basedOn w:val="a0"/>
     <w:uiPriority w:val="21"/>
     <w:qFormat/>
-    <w:rsid w:val="007365F6"/>
+    <w:rsid w:val="00F66A84"/>
     <w:rPr>
       <w:i/>
       <w:iCs/>
@@ -1108,7 +1108,7 @@
     <w:link w:val="aa"/>
     <w:uiPriority w:val="30"/>
     <w:qFormat/>
-    <w:rsid w:val="007365F6"/>
+    <w:rsid w:val="00F66A84"/>
     <w:pPr>
       <w:pBdr>
         <w:top w:val="single" w:sz="4" w:space="10" w:color="0F4761" w:themeColor="accent1" w:themeShade="BF"/>
@@ -1129,7 +1129,7 @@
     <w:basedOn w:val="a0"/>
     <w:link w:val="a9"/>
     <w:uiPriority w:val="30"/>
-    <w:rsid w:val="007365F6"/>
+    <w:rsid w:val="00F66A84"/>
     <w:rPr>
       <w:i/>
       <w:iCs/>
@@ -1141,7 +1141,7 @@
     <w:basedOn w:val="a0"/>
     <w:uiPriority w:val="32"/>
     <w:qFormat/>
-    <w:rsid w:val="007365F6"/>
+    <w:rsid w:val="00F66A84"/>
     <w:rPr>
       <w:b/>
       <w:bCs/>

</xml_diff>